<commit_message>
docs: rewrite handover docs for recipient
</commit_message>
<xml_diff>
--- a/docs/handover/greenputt-handover-docs-version.docx
+++ b/docs/handover/greenputt-handover-docs-version.docx
@@ -27,7 +27,7 @@
           <w:color w:val="555555"/>
           <w:sz w:val="20"/>
         </w:rPr>
-        <w:t>최종 정리일: 2026-06-10  |  대상: 사장님 / 외부 웹 제작·운영 업체</w:t>
+        <w:t>최종 정리일: 2026-06-10  |  용도: 운영, 수정, 배포 담당자 안내</w:t>
       </w:r>
     </w:p>
     <w:tbl>
@@ -54,7 +54,7 @@
                 <w:color w:val="1F3A5F"/>
                 <w:sz w:val="21"/>
               </w:rPr>
-              <w:t>한 줄 요약</w:t>
+              <w:t>핵심 구조</w:t>
             </w:r>
           </w:p>
           <w:p>
@@ -124,6 +124,9 @@
             <w:vAlign w:val="center"/>
           </w:tcPr>
           <w:p>
+            <w:pPr>
+              <w:spacing w:after="0"/>
+            </w:pPr>
             <w:r/>
             <w:r>
               <w:rPr>
@@ -142,6 +145,9 @@
             <w:vAlign w:val="center"/>
           </w:tcPr>
           <w:p>
+            <w:pPr>
+              <w:spacing w:after="0"/>
+            </w:pPr>
             <w:r/>
             <w:r>
               <w:rPr>
@@ -161,6 +167,9 @@
             <w:vAlign w:val="center"/>
           </w:tcPr>
           <w:p>
+            <w:pPr>
+              <w:spacing w:after="0"/>
+            </w:pPr>
             <w:r/>
             <w:r>
               <w:rPr>
@@ -178,6 +187,9 @@
             <w:vAlign w:val="center"/>
           </w:tcPr>
           <w:p>
+            <w:pPr>
+              <w:spacing w:after="0"/>
+            </w:pPr>
             <w:r/>
             <w:r>
               <w:rPr>
@@ -197,6 +209,9 @@
             <w:vAlign w:val="center"/>
           </w:tcPr>
           <w:p>
+            <w:pPr>
+              <w:spacing w:after="0"/>
+            </w:pPr>
             <w:r/>
             <w:r>
               <w:rPr>
@@ -214,6 +229,9 @@
             <w:vAlign w:val="center"/>
           </w:tcPr>
           <w:p>
+            <w:pPr>
+              <w:spacing w:after="0"/>
+            </w:pPr>
             <w:r/>
             <w:r>
               <w:rPr>
@@ -265,6 +283,9 @@
             <w:vAlign w:val="center"/>
           </w:tcPr>
           <w:p>
+            <w:pPr>
+              <w:spacing w:after="0"/>
+            </w:pPr>
             <w:r/>
             <w:r>
               <w:rPr>
@@ -272,7 +293,7 @@
                 <w:b/>
                 <w:sz w:val="20"/>
               </w:rPr>
-              <w:t>포함되는 항목</w:t>
+              <w:t>포함 항목</w:t>
             </w:r>
           </w:p>
         </w:tc>
@@ -283,6 +304,9 @@
             <w:vAlign w:val="center"/>
           </w:tcPr>
           <w:p>
+            <w:pPr>
+              <w:spacing w:after="0"/>
+            </w:pPr>
             <w:r/>
             <w:r>
               <w:rPr>
@@ -290,7 +314,7 @@
                 <w:b/>
                 <w:sz w:val="20"/>
               </w:rPr>
-              <w:t>포함되지 않는 항목</w:t>
+              <w:t>제외 항목</w:t>
             </w:r>
           </w:p>
         </w:tc>
@@ -302,6 +326,9 @@
             <w:vAlign w:val="center"/>
           </w:tcPr>
           <w:p>
+            <w:pPr>
+              <w:spacing w:after="0"/>
+            </w:pPr>
             <w:r/>
             <w:r>
               <w:rPr>
@@ -319,6 +346,9 @@
             <w:vAlign w:val="center"/>
           </w:tcPr>
           <w:p>
+            <w:pPr>
+              <w:spacing w:after="0"/>
+            </w:pPr>
             <w:r/>
             <w:r>
               <w:rPr>
@@ -338,6 +368,9 @@
             <w:vAlign w:val="center"/>
           </w:tcPr>
           <w:p>
+            <w:pPr>
+              <w:spacing w:after="0"/>
+            </w:pPr>
             <w:r/>
             <w:r>
               <w:rPr>
@@ -355,6 +388,9 @@
             <w:vAlign w:val="center"/>
           </w:tcPr>
           <w:p>
+            <w:pPr>
+              <w:spacing w:after="0"/>
+            </w:pPr>
             <w:r/>
             <w:r>
               <w:rPr>
@@ -374,6 +410,9 @@
             <w:vAlign w:val="center"/>
           </w:tcPr>
           <w:p>
+            <w:pPr>
+              <w:spacing w:after="0"/>
+            </w:pPr>
             <w:r/>
             <w:r>
               <w:rPr>
@@ -391,6 +430,9 @@
             <w:vAlign w:val="center"/>
           </w:tcPr>
           <w:p>
+            <w:pPr>
+              <w:spacing w:after="0"/>
+            </w:pPr>
             <w:r/>
             <w:r>
               <w:rPr>
@@ -410,6 +452,9 @@
             <w:vAlign w:val="center"/>
           </w:tcPr>
           <w:p>
+            <w:pPr>
+              <w:spacing w:after="0"/>
+            </w:pPr>
             <w:r/>
             <w:r>
               <w:rPr>
@@ -427,6 +472,9 @@
             <w:vAlign w:val="center"/>
           </w:tcPr>
           <w:p>
+            <w:pPr>
+              <w:spacing w:after="0"/>
+            </w:pPr>
             <w:r/>
             <w:r>
               <w:rPr>
@@ -446,6 +494,9 @@
             <w:vAlign w:val="center"/>
           </w:tcPr>
           <w:p>
+            <w:pPr>
+              <w:spacing w:after="0"/>
+            </w:pPr>
             <w:r/>
             <w:r>
               <w:rPr>
@@ -463,6 +514,9 @@
             <w:vAlign w:val="center"/>
           </w:tcPr>
           <w:p>
+            <w:pPr>
+              <w:spacing w:after="0"/>
+            </w:pPr>
             <w:r/>
             <w:r>
               <w:rPr>
@@ -491,7 +545,7 @@
           <w:color w:val="2E74B5"/>
           <w:sz w:val="32"/>
         </w:rPr>
-        <w:t>3. 배포 제안</w:t>
+        <w:t>3. 배포 방식</w:t>
       </w:r>
     </w:p>
     <w:p>
@@ -504,7 +558,7 @@
           <w:b w:val="0"/>
           <w:sz w:val="22"/>
         </w:rPr>
-        <w:t>Vercel 배포를 우선 권장합니다. 후속 업체가 소스 ZIP을 압축 해제한 뒤 새 Git 저장소를 만들고 Vercel에 연결하면 정적 사이트로 배포할 수 있습니다. 이때 Root Directory는 prototype으로 지정하는 방식을 권장합니다.</w:t>
+        <w:t>Vercel은 정적 사이트 배포와 미리보기 URL 확인이 편하므로 우선 검토할 배포 방식입니다. 소스 ZIP을 압축 해제한 뒤 새 Git 저장소를 만들고 Vercel에 연결합니다. Root Directory는 prototype으로 지정합니다.</w:t>
       </w:r>
     </w:p>
     <w:p>
@@ -517,7 +571,7 @@
           <w:rFonts w:ascii="Calibri" w:hAnsi="Calibri" w:eastAsia="맑은 고딕"/>
           <w:sz w:val="22"/>
         </w:rPr>
-        <w:t>추천: Vercel - 설정과 미리보기 배포, 도메인 연결이 비교적 편합니다.</w:t>
+        <w:t>Vercel: 정적 사이트 배포와 도메인 연결이 비교적 단순합니다.</w:t>
       </w:r>
     </w:p>
     <w:p>
@@ -530,7 +584,7 @@
           <w:rFonts w:ascii="Calibri" w:hAnsi="Calibri" w:eastAsia="맑은 고딕"/>
           <w:sz w:val="22"/>
         </w:rPr>
-        <w:t>대안: GitHub Pages - 가능하지만 배포 브랜치, 루트 경로, CNAME 설정을 정확히 맞춰야 합니다.</w:t>
+        <w:t>GitHub Pages: 대안으로 사용할 수 있으나 배포 루트, 브랜치, CNAME 설정을 정확히 맞춰야 합니다.</w:t>
       </w:r>
     </w:p>
     <w:p>
@@ -568,6 +622,9 @@
             <w:vAlign w:val="center"/>
           </w:tcPr>
           <w:p>
+            <w:pPr>
+              <w:spacing w:after="0"/>
+            </w:pPr>
             <w:r/>
             <w:r>
               <w:rPr>
@@ -586,6 +643,9 @@
             <w:vAlign w:val="center"/>
           </w:tcPr>
           <w:p>
+            <w:pPr>
+              <w:spacing w:after="0"/>
+            </w:pPr>
             <w:r/>
             <w:r>
               <w:rPr>
@@ -604,6 +664,9 @@
             <w:vAlign w:val="center"/>
           </w:tcPr>
           <w:p>
+            <w:pPr>
+              <w:spacing w:after="0"/>
+            </w:pPr>
             <w:r/>
             <w:r>
               <w:rPr>
@@ -622,6 +685,9 @@
             <w:vAlign w:val="center"/>
           </w:tcPr>
           <w:p>
+            <w:pPr>
+              <w:spacing w:after="0"/>
+            </w:pPr>
             <w:r/>
             <w:r>
               <w:rPr>
@@ -641,6 +707,9 @@
             <w:vAlign w:val="center"/>
           </w:tcPr>
           <w:p>
+            <w:pPr>
+              <w:spacing w:after="0"/>
+            </w:pPr>
             <w:r/>
             <w:r>
               <w:rPr>
@@ -658,6 +727,9 @@
             <w:vAlign w:val="center"/>
           </w:tcPr>
           <w:p>
+            <w:pPr>
+              <w:spacing w:after="0"/>
+            </w:pPr>
             <w:r/>
             <w:r>
               <w:rPr>
@@ -675,6 +747,9 @@
             <w:vAlign w:val="center"/>
           </w:tcPr>
           <w:p>
+            <w:pPr>
+              <w:spacing w:after="0"/>
+            </w:pPr>
             <w:r/>
             <w:r>
               <w:rPr>
@@ -692,6 +767,9 @@
             <w:vAlign w:val="center"/>
           </w:tcPr>
           <w:p>
+            <w:pPr>
+              <w:spacing w:after="0"/>
+            </w:pPr>
             <w:r/>
             <w:r>
               <w:rPr>
@@ -711,6 +789,9 @@
             <w:vAlign w:val="center"/>
           </w:tcPr>
           <w:p>
+            <w:pPr>
+              <w:spacing w:after="0"/>
+            </w:pPr>
             <w:r/>
             <w:r>
               <w:rPr>
@@ -728,6 +809,9 @@
             <w:vAlign w:val="center"/>
           </w:tcPr>
           <w:p>
+            <w:pPr>
+              <w:spacing w:after="0"/>
+            </w:pPr>
             <w:r/>
             <w:r>
               <w:rPr>
@@ -745,6 +829,9 @@
             <w:vAlign w:val="center"/>
           </w:tcPr>
           <w:p>
+            <w:pPr>
+              <w:spacing w:after="0"/>
+            </w:pPr>
             <w:r/>
             <w:r>
               <w:rPr>
@@ -762,6 +849,9 @@
             <w:vAlign w:val="center"/>
           </w:tcPr>
           <w:p>
+            <w:pPr>
+              <w:spacing w:after="0"/>
+            </w:pPr>
             <w:r/>
             <w:r>
               <w:rPr>
@@ -803,7 +893,7 @@
           <w:rFonts w:ascii="Calibri" w:hAnsi="Calibri" w:eastAsia="맑은 고딕"/>
           <w:sz w:val="22"/>
         </w:rPr>
-        <w:t>아임웹 도메인 화면 기준 greenputt.kr이 대표 도메인으로 선택되어 있습니다.</w:t>
+        <w:t>greenputt.kr은 아임웹 대표 도메인으로 선택된 상태입니다.</w:t>
       </w:r>
     </w:p>
     <w:p>
@@ -816,7 +906,7 @@
           <w:rFonts w:ascii="Calibri" w:hAnsi="Calibri" w:eastAsia="맑은 고딕"/>
           <w:sz w:val="22"/>
         </w:rPr>
-        <w:t>COMODO Basic SSL 365 결제 이력이 있으나, 실제 개인 도메인 SSL 적용 상태는 인수 후 재확인해야 합니다.</w:t>
+        <w:t>COMODO Basic SSL 365 결제 이력이 있으나, 실제 개인 도메인 SSL 적용 상태는 인수 후 재확인합니다.</w:t>
       </w:r>
     </w:p>
     <w:tbl>
@@ -856,7 +946,7 @@
                 <w:b w:val="0"/>
                 <w:sz w:val="21"/>
               </w:rPr>
-              <w:t>DNS 변경 전에는 반드시 가비아에서 현재 레코드를 백업해야 합니다. 메일, SPF, DKIM, DMARC, Google 인증 레코드는 삭제하지 않습니다.</w:t>
+              <w:t>DNS 변경 전에는 가비아에서 현재 레코드를 백업합니다. 메일, SPF, DKIM, DMARC, Google 인증 레코드는 삭제하지 않습니다.</w:t>
             </w:r>
           </w:p>
         </w:tc>
@@ -891,7 +981,7 @@
           <w:b w:val="0"/>
           <w:sz w:val="22"/>
         </w:rPr>
-        <w:t>비밀번호는 공개 링크 폴더에 평문으로 넣지 않고, 최종 전달 시 별도 보안 채널로 전달하는 것을 권장합니다.</w:t>
+        <w:t>계정 정보는 공개 링크나 소스 ZIP에 평문으로 저장하지 않습니다. 실제 비밀번호는 별도 보안 채널로 전달받아 관리합니다.</w:t>
       </w:r>
     </w:p>
     <w:tbl>
@@ -914,6 +1004,9 @@
             <w:vAlign w:val="center"/>
           </w:tcPr>
           <w:p>
+            <w:pPr>
+              <w:spacing w:after="0"/>
+            </w:pPr>
             <w:r/>
             <w:r>
               <w:rPr>
@@ -932,6 +1025,9 @@
             <w:vAlign w:val="center"/>
           </w:tcPr>
           <w:p>
+            <w:pPr>
+              <w:spacing w:after="0"/>
+            </w:pPr>
             <w:r/>
             <w:r>
               <w:rPr>
@@ -950,6 +1046,9 @@
             <w:vAlign w:val="center"/>
           </w:tcPr>
           <w:p>
+            <w:pPr>
+              <w:spacing w:after="0"/>
+            </w:pPr>
             <w:r/>
             <w:r>
               <w:rPr>
@@ -969,6 +1068,9 @@
             <w:vAlign w:val="center"/>
           </w:tcPr>
           <w:p>
+            <w:pPr>
+              <w:spacing w:after="0"/>
+            </w:pPr>
             <w:r/>
             <w:r>
               <w:rPr>
@@ -986,6 +1088,9 @@
             <w:vAlign w:val="center"/>
           </w:tcPr>
           <w:p>
+            <w:pPr>
+              <w:spacing w:after="0"/>
+            </w:pPr>
             <w:r/>
             <w:r>
               <w:rPr>
@@ -1003,6 +1108,9 @@
             <w:vAlign w:val="center"/>
           </w:tcPr>
           <w:p>
+            <w:pPr>
+              <w:spacing w:after="0"/>
+            </w:pPr>
             <w:r/>
             <w:r>
               <w:rPr>
@@ -1022,6 +1130,9 @@
             <w:vAlign w:val="center"/>
           </w:tcPr>
           <w:p>
+            <w:pPr>
+              <w:spacing w:after="0"/>
+            </w:pPr>
             <w:r/>
             <w:r>
               <w:rPr>
@@ -1039,6 +1150,9 @@
             <w:vAlign w:val="center"/>
           </w:tcPr>
           <w:p>
+            <w:pPr>
+              <w:spacing w:after="0"/>
+            </w:pPr>
             <w:r/>
             <w:r>
               <w:rPr>
@@ -1056,6 +1170,9 @@
             <w:vAlign w:val="center"/>
           </w:tcPr>
           <w:p>
+            <w:pPr>
+              <w:spacing w:after="0"/>
+            </w:pPr>
             <w:r/>
             <w:r>
               <w:rPr>
@@ -1075,6 +1192,9 @@
             <w:vAlign w:val="center"/>
           </w:tcPr>
           <w:p>
+            <w:pPr>
+              <w:spacing w:after="0"/>
+            </w:pPr>
             <w:r/>
             <w:r>
               <w:rPr>
@@ -1092,6 +1212,9 @@
             <w:vAlign w:val="center"/>
           </w:tcPr>
           <w:p>
+            <w:pPr>
+              <w:spacing w:after="0"/>
+            </w:pPr>
             <w:r/>
             <w:r>
               <w:rPr>
@@ -1108,6 +1231,9 @@
             <w:vAlign w:val="center"/>
           </w:tcPr>
           <w:p>
+            <w:pPr>
+              <w:spacing w:after="0"/>
+            </w:pPr>
             <w:r/>
             <w:r>
               <w:rPr>
@@ -1126,6 +1252,9 @@
             <w:vAlign w:val="center"/>
           </w:tcPr>
           <w:p>
+            <w:pPr>
+              <w:spacing w:after="0"/>
+            </w:pPr>
             <w:r/>
             <w:r>
               <w:rPr>
@@ -1143,6 +1272,9 @@
             <w:vAlign w:val="center"/>
           </w:tcPr>
           <w:p>
+            <w:pPr>
+              <w:spacing w:after="0"/>
+            </w:pPr>
             <w:r/>
             <w:r>
               <w:rPr>
@@ -1159,6 +1291,9 @@
             <w:vAlign w:val="center"/>
           </w:tcPr>
           <w:p>
+            <w:pPr>
+              <w:spacing w:after="0"/>
+            </w:pPr>
             <w:r/>
             <w:r>
               <w:rPr>
@@ -1177,6 +1312,9 @@
             <w:vAlign w:val="center"/>
           </w:tcPr>
           <w:p>
+            <w:pPr>
+              <w:spacing w:after="0"/>
+            </w:pPr>
             <w:r/>
             <w:r>
               <w:rPr>
@@ -1194,6 +1332,9 @@
             <w:vAlign w:val="center"/>
           </w:tcPr>
           <w:p>
+            <w:pPr>
+              <w:spacing w:after="0"/>
+            </w:pPr>
             <w:r/>
             <w:r>
               <w:rPr>
@@ -1210,6 +1351,9 @@
             <w:vAlign w:val="center"/>
           </w:tcPr>
           <w:p>
+            <w:pPr>
+              <w:spacing w:after="0"/>
+            </w:pPr>
             <w:r/>
             <w:r>
               <w:rPr>
@@ -1228,6 +1372,9 @@
             <w:vAlign w:val="center"/>
           </w:tcPr>
           <w:p>
+            <w:pPr>
+              <w:spacing w:after="0"/>
+            </w:pPr>
             <w:r/>
             <w:r>
               <w:rPr>
@@ -1245,6 +1392,9 @@
             <w:vAlign w:val="center"/>
           </w:tcPr>
           <w:p>
+            <w:pPr>
+              <w:spacing w:after="0"/>
+            </w:pPr>
             <w:r/>
             <w:r>
               <w:rPr>
@@ -1261,6 +1411,9 @@
             <w:vAlign w:val="center"/>
           </w:tcPr>
           <w:p>
+            <w:pPr>
+              <w:spacing w:after="0"/>
+            </w:pPr>
             <w:r/>
             <w:r>
               <w:rPr>
@@ -1279,6 +1432,9 @@
             <w:vAlign w:val="center"/>
           </w:tcPr>
           <w:p>
+            <w:pPr>
+              <w:spacing w:after="0"/>
+            </w:pPr>
             <w:r/>
             <w:r>
               <w:rPr>
@@ -1296,6 +1452,9 @@
             <w:vAlign w:val="center"/>
           </w:tcPr>
           <w:p>
+            <w:pPr>
+              <w:spacing w:after="0"/>
+            </w:pPr>
             <w:r/>
             <w:r>
               <w:rPr>
@@ -1312,6 +1471,9 @@
             <w:vAlign w:val="center"/>
           </w:tcPr>
           <w:p>
+            <w:pPr>
+              <w:spacing w:after="0"/>
+            </w:pPr>
             <w:r/>
             <w:r>
               <w:rPr>
@@ -1379,7 +1541,7 @@
           <w:rFonts w:ascii="Calibri" w:hAnsi="Calibri" w:eastAsia="맑은 고딕"/>
           <w:sz w:val="22"/>
         </w:rPr>
-        <w:t>상세페이지나 상품 이미지를 수정할 때 신형/구형 로고를 혼동하지 않도록 확인해야 합니다.</w:t>
+        <w:t>상세페이지나 상품 이미지를 수정할 때 신형/구형 로고를 혼동하지 않도록 확인합니다.</w:t>
       </w:r>
     </w:p>
     <w:p>

</xml_diff>